<commit_message>
docs: Update all system diagrams
</commit_message>
<xml_diff>
--- a/docs/hardware/EEG-Measurement-Circuit-Design.docx
+++ b/docs/hardware/EEG-Measurement-Circuit-Design.docx
@@ -114,7 +114,7 @@
           <w:kern w:val="2"/>
           <w:sz w:val="24"/>
           <w:szCs w:val="24"/>
-          <w:lang w:val="en-001"/>
+          <w:lang/>
           <w14:ligatures w14:val="standardContextual"/>
         </w:rPr>
         <w:id w:val="-368915575"/>
@@ -154,7 +154,7 @@
               <w:kern w:val="2"/>
               <w:sz w:val="24"/>
               <w:szCs w:val="24"/>
-              <w:lang w:val="en-001" w:eastAsia="en-001"/>
+              <w:lang/>
               <w14:ligatures w14:val="standardContextual"/>
             </w:rPr>
           </w:pPr>
@@ -182,7 +182,7 @@
                 <w:kern w:val="2"/>
                 <w:sz w:val="24"/>
                 <w:szCs w:val="24"/>
-                <w:lang w:val="en-001" w:eastAsia="en-001"/>
+                <w:lang/>
                 <w14:ligatures w14:val="standardContextual"/>
               </w:rPr>
               <w:tab/>
@@ -257,7 +257,7 @@
               <w:kern w:val="2"/>
               <w:sz w:val="24"/>
               <w:szCs w:val="24"/>
-              <w:lang w:val="en-001" w:eastAsia="en-001"/>
+              <w:lang/>
               <w14:ligatures w14:val="standardContextual"/>
             </w:rPr>
           </w:pPr>
@@ -276,7 +276,7 @@
                 <w:kern w:val="2"/>
                 <w:sz w:val="24"/>
                 <w:szCs w:val="24"/>
-                <w:lang w:val="en-001" w:eastAsia="en-001"/>
+                <w:lang/>
                 <w14:ligatures w14:val="standardContextual"/>
               </w:rPr>
               <w:tab/>
@@ -351,7 +351,7 @@
               <w:kern w:val="2"/>
               <w:sz w:val="24"/>
               <w:szCs w:val="24"/>
-              <w:lang w:val="en-001" w:eastAsia="en-001"/>
+              <w:lang/>
               <w14:ligatures w14:val="standardContextual"/>
             </w:rPr>
           </w:pPr>
@@ -370,7 +370,7 @@
                 <w:kern w:val="2"/>
                 <w:sz w:val="24"/>
                 <w:szCs w:val="24"/>
-                <w:lang w:val="en-001" w:eastAsia="en-001"/>
+                <w:lang/>
                 <w14:ligatures w14:val="standardContextual"/>
               </w:rPr>
               <w:tab/>
@@ -445,7 +445,7 @@
               <w:kern w:val="2"/>
               <w:sz w:val="24"/>
               <w:szCs w:val="24"/>
-              <w:lang w:val="en-001" w:eastAsia="en-001"/>
+              <w:lang/>
               <w14:ligatures w14:val="standardContextual"/>
             </w:rPr>
           </w:pPr>
@@ -464,7 +464,7 @@
                 <w:kern w:val="2"/>
                 <w:sz w:val="24"/>
                 <w:szCs w:val="24"/>
-                <w:lang w:val="en-001" w:eastAsia="en-001"/>
+                <w:lang/>
                 <w14:ligatures w14:val="standardContextual"/>
               </w:rPr>
               <w:tab/>
@@ -539,7 +539,7 @@
               <w:kern w:val="2"/>
               <w:sz w:val="24"/>
               <w:szCs w:val="24"/>
-              <w:lang w:val="en-001" w:eastAsia="en-001"/>
+              <w:lang/>
               <w14:ligatures w14:val="standardContextual"/>
             </w:rPr>
           </w:pPr>
@@ -558,7 +558,7 @@
                 <w:kern w:val="2"/>
                 <w:sz w:val="24"/>
                 <w:szCs w:val="24"/>
-                <w:lang w:val="en-001" w:eastAsia="en-001"/>
+                <w:lang/>
                 <w14:ligatures w14:val="standardContextual"/>
               </w:rPr>
               <w:tab/>
@@ -633,7 +633,7 @@
               <w:kern w:val="2"/>
               <w:sz w:val="24"/>
               <w:szCs w:val="24"/>
-              <w:lang w:val="en-001" w:eastAsia="en-001"/>
+              <w:lang/>
               <w14:ligatures w14:val="standardContextual"/>
             </w:rPr>
           </w:pPr>
@@ -652,7 +652,7 @@
                 <w:kern w:val="2"/>
                 <w:sz w:val="24"/>
                 <w:szCs w:val="24"/>
-                <w:lang w:val="en-001" w:eastAsia="en-001"/>
+                <w:lang/>
                 <w14:ligatures w14:val="standardContextual"/>
               </w:rPr>
               <w:tab/>
@@ -727,7 +727,7 @@
               <w:kern w:val="2"/>
               <w:sz w:val="24"/>
               <w:szCs w:val="24"/>
-              <w:lang w:val="en-001" w:eastAsia="en-001"/>
+              <w:lang/>
               <w14:ligatures w14:val="standardContextual"/>
             </w:rPr>
           </w:pPr>
@@ -746,7 +746,7 @@
                 <w:kern w:val="2"/>
                 <w:sz w:val="24"/>
                 <w:szCs w:val="24"/>
-                <w:lang w:val="en-001" w:eastAsia="en-001"/>
+                <w:lang/>
                 <w14:ligatures w14:val="standardContextual"/>
               </w:rPr>
               <w:tab/>
@@ -821,7 +821,7 @@
               <w:kern w:val="2"/>
               <w:sz w:val="24"/>
               <w:szCs w:val="24"/>
-              <w:lang w:val="en-001" w:eastAsia="en-001"/>
+              <w:lang/>
               <w14:ligatures w14:val="standardContextual"/>
             </w:rPr>
           </w:pPr>
@@ -840,7 +840,7 @@
                 <w:kern w:val="2"/>
                 <w:sz w:val="24"/>
                 <w:szCs w:val="24"/>
-                <w:lang w:val="en-001" w:eastAsia="en-001"/>
+                <w:lang/>
                 <w14:ligatures w14:val="standardContextual"/>
               </w:rPr>
               <w:tab/>
@@ -915,7 +915,7 @@
               <w:kern w:val="2"/>
               <w:sz w:val="24"/>
               <w:szCs w:val="24"/>
-              <w:lang w:val="en-001" w:eastAsia="en-001"/>
+              <w:lang/>
               <w14:ligatures w14:val="standardContextual"/>
             </w:rPr>
           </w:pPr>
@@ -934,7 +934,7 @@
                 <w:kern w:val="2"/>
                 <w:sz w:val="24"/>
                 <w:szCs w:val="24"/>
-                <w:lang w:val="en-001" w:eastAsia="en-001"/>
+                <w:lang/>
                 <w14:ligatures w14:val="standardContextual"/>
               </w:rPr>
               <w:tab/>
@@ -1009,7 +1009,7 @@
               <w:kern w:val="2"/>
               <w:sz w:val="24"/>
               <w:szCs w:val="24"/>
-              <w:lang w:val="en-001" w:eastAsia="en-001"/>
+              <w:lang/>
               <w14:ligatures w14:val="standardContextual"/>
             </w:rPr>
           </w:pPr>
@@ -1028,7 +1028,7 @@
                 <w:kern w:val="2"/>
                 <w:sz w:val="24"/>
                 <w:szCs w:val="24"/>
-                <w:lang w:val="en-001" w:eastAsia="en-001"/>
+                <w:lang/>
                 <w14:ligatures w14:val="standardContextual"/>
               </w:rPr>
               <w:tab/>
@@ -1103,7 +1103,7 @@
               <w:kern w:val="2"/>
               <w:sz w:val="24"/>
               <w:szCs w:val="24"/>
-              <w:lang w:val="en-001" w:eastAsia="en-001"/>
+              <w:lang/>
               <w14:ligatures w14:val="standardContextual"/>
             </w:rPr>
           </w:pPr>
@@ -1122,7 +1122,7 @@
                 <w:kern w:val="2"/>
                 <w:sz w:val="24"/>
                 <w:szCs w:val="24"/>
-                <w:lang w:val="en-001" w:eastAsia="en-001"/>
+                <w:lang/>
                 <w14:ligatures w14:val="standardContextual"/>
               </w:rPr>
               <w:tab/>
@@ -1197,7 +1197,7 @@
               <w:kern w:val="2"/>
               <w:sz w:val="24"/>
               <w:szCs w:val="24"/>
-              <w:lang w:val="en-001" w:eastAsia="en-001"/>
+              <w:lang/>
               <w14:ligatures w14:val="standardContextual"/>
             </w:rPr>
           </w:pPr>
@@ -1216,7 +1216,7 @@
                 <w:kern w:val="2"/>
                 <w:sz w:val="24"/>
                 <w:szCs w:val="24"/>
-                <w:lang w:val="en-001" w:eastAsia="en-001"/>
+                <w:lang/>
                 <w14:ligatures w14:val="standardContextual"/>
               </w:rPr>
               <w:tab/>
@@ -1291,7 +1291,7 @@
               <w:kern w:val="2"/>
               <w:sz w:val="24"/>
               <w:szCs w:val="24"/>
-              <w:lang w:val="en-001" w:eastAsia="en-001"/>
+              <w:lang/>
               <w14:ligatures w14:val="standardContextual"/>
             </w:rPr>
           </w:pPr>
@@ -1310,7 +1310,7 @@
                 <w:kern w:val="2"/>
                 <w:sz w:val="24"/>
                 <w:szCs w:val="24"/>
-                <w:lang w:val="en-001" w:eastAsia="en-001"/>
+                <w:lang/>
                 <w14:ligatures w14:val="standardContextual"/>
               </w:rPr>
               <w:tab/>
@@ -1385,7 +1385,7 @@
               <w:kern w:val="2"/>
               <w:sz w:val="24"/>
               <w:szCs w:val="24"/>
-              <w:lang w:val="en-001" w:eastAsia="en-001"/>
+              <w:lang/>
               <w14:ligatures w14:val="standardContextual"/>
             </w:rPr>
           </w:pPr>
@@ -1404,7 +1404,7 @@
                 <w:kern w:val="2"/>
                 <w:sz w:val="24"/>
                 <w:szCs w:val="24"/>
-                <w:lang w:val="en-001" w:eastAsia="en-001"/>
+                <w:lang/>
                 <w14:ligatures w14:val="standardContextual"/>
               </w:rPr>
               <w:tab/>
@@ -1479,7 +1479,7 @@
               <w:kern w:val="2"/>
               <w:sz w:val="24"/>
               <w:szCs w:val="24"/>
-              <w:lang w:val="en-001" w:eastAsia="en-001"/>
+              <w:lang/>
               <w14:ligatures w14:val="standardContextual"/>
             </w:rPr>
           </w:pPr>
@@ -1498,7 +1498,7 @@
                 <w:kern w:val="2"/>
                 <w:sz w:val="24"/>
                 <w:szCs w:val="24"/>
-                <w:lang w:val="en-001" w:eastAsia="en-001"/>
+                <w:lang/>
                 <w14:ligatures w14:val="standardContextual"/>
               </w:rPr>
               <w:tab/>
@@ -1573,7 +1573,7 @@
               <w:kern w:val="2"/>
               <w:sz w:val="24"/>
               <w:szCs w:val="24"/>
-              <w:lang w:val="en-001" w:eastAsia="en-001"/>
+              <w:lang/>
               <w14:ligatures w14:val="standardContextual"/>
             </w:rPr>
           </w:pPr>
@@ -1592,7 +1592,7 @@
                 <w:kern w:val="2"/>
                 <w:sz w:val="24"/>
                 <w:szCs w:val="24"/>
-                <w:lang w:val="en-001" w:eastAsia="en-001"/>
+                <w:lang/>
                 <w14:ligatures w14:val="standardContextual"/>
               </w:rPr>
               <w:tab/>
@@ -1667,7 +1667,7 @@
               <w:kern w:val="2"/>
               <w:sz w:val="24"/>
               <w:szCs w:val="24"/>
-              <w:lang w:val="en-001" w:eastAsia="en-001"/>
+              <w:lang/>
               <w14:ligatures w14:val="standardContextual"/>
             </w:rPr>
           </w:pPr>
@@ -1686,7 +1686,7 @@
                 <w:kern w:val="2"/>
                 <w:sz w:val="24"/>
                 <w:szCs w:val="24"/>
-                <w:lang w:val="en-001" w:eastAsia="en-001"/>
+                <w:lang/>
                 <w14:ligatures w14:val="standardContextual"/>
               </w:rPr>
               <w:tab/>
@@ -1761,7 +1761,7 @@
               <w:kern w:val="2"/>
               <w:sz w:val="24"/>
               <w:szCs w:val="24"/>
-              <w:lang w:val="en-001" w:eastAsia="en-001"/>
+              <w:lang/>
               <w14:ligatures w14:val="standardContextual"/>
             </w:rPr>
           </w:pPr>
@@ -1780,7 +1780,7 @@
                 <w:kern w:val="2"/>
                 <w:sz w:val="24"/>
                 <w:szCs w:val="24"/>
-                <w:lang w:val="en-001" w:eastAsia="en-001"/>
+                <w:lang/>
                 <w14:ligatures w14:val="standardContextual"/>
               </w:rPr>
               <w:tab/>
@@ -1855,7 +1855,7 @@
               <w:kern w:val="2"/>
               <w:sz w:val="24"/>
               <w:szCs w:val="24"/>
-              <w:lang w:val="en-001" w:eastAsia="en-001"/>
+              <w:lang/>
               <w14:ligatures w14:val="standardContextual"/>
             </w:rPr>
           </w:pPr>
@@ -1874,7 +1874,7 @@
                 <w:kern w:val="2"/>
                 <w:sz w:val="24"/>
                 <w:szCs w:val="24"/>
-                <w:lang w:val="en-001" w:eastAsia="en-001"/>
+                <w:lang/>
                 <w14:ligatures w14:val="standardContextual"/>
               </w:rPr>
               <w:tab/>
@@ -1949,7 +1949,7 @@
               <w:kern w:val="2"/>
               <w:sz w:val="24"/>
               <w:szCs w:val="24"/>
-              <w:lang w:val="en-001" w:eastAsia="en-001"/>
+              <w:lang/>
               <w14:ligatures w14:val="standardContextual"/>
             </w:rPr>
           </w:pPr>
@@ -1968,7 +1968,7 @@
                 <w:kern w:val="2"/>
                 <w:sz w:val="24"/>
                 <w:szCs w:val="24"/>
-                <w:lang w:val="en-001" w:eastAsia="en-001"/>
+                <w:lang/>
                 <w14:ligatures w14:val="standardContextual"/>
               </w:rPr>
               <w:tab/>
@@ -2043,7 +2043,7 @@
               <w:kern w:val="2"/>
               <w:sz w:val="24"/>
               <w:szCs w:val="24"/>
-              <w:lang w:val="en-001" w:eastAsia="en-001"/>
+              <w:lang/>
               <w14:ligatures w14:val="standardContextual"/>
             </w:rPr>
           </w:pPr>
@@ -2062,7 +2062,7 @@
                 <w:kern w:val="2"/>
                 <w:sz w:val="24"/>
                 <w:szCs w:val="24"/>
-                <w:lang w:val="en-001" w:eastAsia="en-001"/>
+                <w:lang/>
                 <w14:ligatures w14:val="standardContextual"/>
               </w:rPr>
               <w:tab/>
@@ -2137,7 +2137,7 @@
               <w:kern w:val="2"/>
               <w:sz w:val="24"/>
               <w:szCs w:val="24"/>
-              <w:lang w:val="en-001" w:eastAsia="en-001"/>
+              <w:lang/>
               <w14:ligatures w14:val="standardContextual"/>
             </w:rPr>
           </w:pPr>
@@ -2156,7 +2156,7 @@
                 <w:kern w:val="2"/>
                 <w:sz w:val="24"/>
                 <w:szCs w:val="24"/>
-                <w:lang w:val="en-001" w:eastAsia="en-001"/>
+                <w:lang/>
                 <w14:ligatures w14:val="standardContextual"/>
               </w:rPr>
               <w:tab/>
@@ -2231,7 +2231,7 @@
               <w:kern w:val="2"/>
               <w:sz w:val="24"/>
               <w:szCs w:val="24"/>
-              <w:lang w:val="en-001" w:eastAsia="en-001"/>
+              <w:lang/>
               <w14:ligatures w14:val="standardContextual"/>
             </w:rPr>
           </w:pPr>
@@ -2250,7 +2250,7 @@
                 <w:kern w:val="2"/>
                 <w:sz w:val="24"/>
                 <w:szCs w:val="24"/>
-                <w:lang w:val="en-001" w:eastAsia="en-001"/>
+                <w:lang/>
                 <w14:ligatures w14:val="standardContextual"/>
               </w:rPr>
               <w:tab/>
@@ -2325,7 +2325,7 @@
               <w:kern w:val="2"/>
               <w:sz w:val="24"/>
               <w:szCs w:val="24"/>
-              <w:lang w:val="en-001" w:eastAsia="en-001"/>
+              <w:lang/>
               <w14:ligatures w14:val="standardContextual"/>
             </w:rPr>
           </w:pPr>
@@ -2344,7 +2344,7 @@
                 <w:kern w:val="2"/>
                 <w:sz w:val="24"/>
                 <w:szCs w:val="24"/>
-                <w:lang w:val="en-001" w:eastAsia="en-001"/>
+                <w:lang/>
                 <w14:ligatures w14:val="standardContextual"/>
               </w:rPr>
               <w:tab/>
@@ -2419,7 +2419,7 @@
               <w:kern w:val="2"/>
               <w:sz w:val="24"/>
               <w:szCs w:val="24"/>
-              <w:lang w:val="en-001" w:eastAsia="en-001"/>
+              <w:lang/>
               <w14:ligatures w14:val="standardContextual"/>
             </w:rPr>
           </w:pPr>
@@ -2438,7 +2438,7 @@
                 <w:kern w:val="2"/>
                 <w:sz w:val="24"/>
                 <w:szCs w:val="24"/>
-                <w:lang w:val="en-001" w:eastAsia="en-001"/>
+                <w:lang/>
                 <w14:ligatures w14:val="standardContextual"/>
               </w:rPr>
               <w:tab/>
@@ -2513,7 +2513,7 @@
               <w:kern w:val="2"/>
               <w:sz w:val="24"/>
               <w:szCs w:val="24"/>
-              <w:lang w:val="en-001" w:eastAsia="en-001"/>
+              <w:lang/>
               <w14:ligatures w14:val="standardContextual"/>
             </w:rPr>
           </w:pPr>
@@ -2532,7 +2532,7 @@
                 <w:kern w:val="2"/>
                 <w:sz w:val="24"/>
                 <w:szCs w:val="24"/>
-                <w:lang w:val="en-001" w:eastAsia="en-001"/>
+                <w:lang/>
                 <w14:ligatures w14:val="standardContextual"/>
               </w:rPr>
               <w:tab/>
@@ -2607,7 +2607,7 @@
               <w:kern w:val="2"/>
               <w:sz w:val="24"/>
               <w:szCs w:val="24"/>
-              <w:lang w:val="en-001" w:eastAsia="en-001"/>
+              <w:lang/>
               <w14:ligatures w14:val="standardContextual"/>
             </w:rPr>
           </w:pPr>
@@ -2626,7 +2626,7 @@
                 <w:kern w:val="2"/>
                 <w:sz w:val="24"/>
                 <w:szCs w:val="24"/>
-                <w:lang w:val="en-001" w:eastAsia="en-001"/>
+                <w:lang/>
                 <w14:ligatures w14:val="standardContextual"/>
               </w:rPr>
               <w:tab/>
@@ -2701,7 +2701,7 @@
               <w:kern w:val="2"/>
               <w:sz w:val="24"/>
               <w:szCs w:val="24"/>
-              <w:lang w:val="en-001" w:eastAsia="en-001"/>
+              <w:lang/>
               <w14:ligatures w14:val="standardContextual"/>
             </w:rPr>
           </w:pPr>
@@ -2720,7 +2720,7 @@
                 <w:kern w:val="2"/>
                 <w:sz w:val="24"/>
                 <w:szCs w:val="24"/>
-                <w:lang w:val="en-001" w:eastAsia="en-001"/>
+                <w:lang/>
                 <w14:ligatures w14:val="standardContextual"/>
               </w:rPr>
               <w:tab/>
@@ -4343,7 +4343,7 @@
         <mc:AlternateContent>
           <mc:Choice Requires="wpc">
             <w:drawing>
-              <wp:inline distT="0" distB="0" distL="0" distR="0" wp14:anchorId="023E9442" wp14:editId="610D4F59">
+              <wp:inline distT="0" distB="0" distL="0" distR="0" wp14:anchorId="023E9442" wp14:editId="62403DEC">
                 <wp:extent cx="5652770" cy="2877820"/>
                 <wp:effectExtent l="0" t="0" r="5080" b="0"/>
                 <wp:docPr id="673665650" name="Canvas 5"/>
@@ -4588,7 +4588,7 @@
         </w:rPr>
         <w:lastRenderedPageBreak/>
         <w:drawing>
-          <wp:inline distT="0" distB="0" distL="0" distR="0" wp14:anchorId="580FA50F" wp14:editId="3776BBBF">
+          <wp:inline distT="0" distB="0" distL="0" distR="0" wp14:anchorId="580FA50F" wp14:editId="5BA4F462">
             <wp:extent cx="4665533" cy="1590261"/>
             <wp:effectExtent l="0" t="0" r="1905" b="0"/>
             <wp:docPr id="1656925240" name="Picture 6" descr="A group of black and white electrodes&#10;&#10;Description automatically generated"/>
@@ -10829,19 +10829,7 @@
           <w:rPr>
             <w:rFonts w:ascii="Cambria Math" w:hAnsi="Cambria Math"/>
           </w:rPr>
-          <m:t>=1</m:t>
-        </m:r>
-        <m:r>
-          <w:rPr>
-            <w:rFonts w:ascii="Cambria Math" w:hAnsi="Cambria Math"/>
-          </w:rPr>
-          <m:t>0</m:t>
-        </m:r>
-        <m:r>
-          <w:rPr>
-            <w:rFonts w:ascii="Cambria Math" w:hAnsi="Cambria Math"/>
-          </w:rPr>
-          <m:t>000</m:t>
+          <m:t>=10000</m:t>
         </m:r>
       </m:oMath>
       <w:r>
@@ -10898,19 +10886,7 @@
           <w:rPr>
             <w:rFonts w:ascii="Cambria Math" w:hAnsi="Cambria Math"/>
           </w:rPr>
-          <m:t>=1</m:t>
-        </m:r>
-        <m:r>
-          <w:rPr>
-            <w:rFonts w:ascii="Cambria Math" w:hAnsi="Cambria Math"/>
-          </w:rPr>
-          <m:t>1</m:t>
-        </m:r>
-        <m:r>
-          <w:rPr>
-            <w:rFonts w:ascii="Cambria Math" w:hAnsi="Cambria Math"/>
-          </w:rPr>
-          <m:t>0dB @ G=1000</m:t>
+          <m:t>=110dB @ G=1000</m:t>
         </m:r>
       </m:oMath>
       <w:r>
@@ -10970,13 +10946,7 @@
           <w:rPr>
             <w:rFonts w:ascii="Cambria Math" w:hAnsi="Cambria Math"/>
           </w:rPr>
-          <m:t>=20kHz</m:t>
-        </m:r>
-        <m:r>
-          <w:rPr>
-            <w:rFonts w:ascii="Cambria Math" w:hAnsi="Cambria Math"/>
-          </w:rPr>
-          <m:t>@G=1000</m:t>
+          <m:t>=20kHz@G=1000</m:t>
         </m:r>
       </m:oMath>
       <w:r>
@@ -10990,13 +10960,7 @@
           <w:rPr>
             <w:rFonts w:ascii="Cambria Math" w:eastAsiaTheme="minorEastAsia" w:hAnsi="Cambria Math"/>
           </w:rPr>
-          <m:t>SR=</m:t>
-        </m:r>
-        <m:r>
-          <w:rPr>
-            <w:rFonts w:ascii="Cambria Math" w:eastAsiaTheme="minorEastAsia" w:hAnsi="Cambria Math"/>
-          </w:rPr>
-          <m:t>1.2V/μs@G=5</m:t>
+          <m:t>SR=1.2V/μs@G=5</m:t>
         </m:r>
       </m:oMath>
       <w:r>
@@ -11013,6 +10977,9 @@
         <w:jc w:val="center"/>
       </w:pPr>
       <w:r>
+        <w:rPr>
+          <w:noProof/>
+        </w:rPr>
         <w:lastRenderedPageBreak/>
         <w:drawing>
           <wp:inline distT="0" distB="0" distL="0" distR="0" wp14:anchorId="75A60939" wp14:editId="7F3BB5E1">
@@ -12623,7 +12590,7 @@
         </w:rPr>
         <w:lastRenderedPageBreak/>
         <w:drawing>
-          <wp:inline distT="0" distB="0" distL="0" distR="0" wp14:anchorId="1A11975D" wp14:editId="3CB99ADC">
+          <wp:inline distT="0" distB="0" distL="0" distR="0" wp14:anchorId="1A11975D" wp14:editId="368D0927">
             <wp:extent cx="3651250" cy="1793241"/>
             <wp:effectExtent l="0" t="0" r="6350" b="0"/>
             <wp:docPr id="1488230897" name="Picture 2"/>
@@ -16755,13 +16722,7 @@
           <w:rPr>
             <w:rFonts w:ascii="Cambria Math" w:hAnsi="Cambria Math"/>
           </w:rPr>
-          <m:t>f=</m:t>
-        </m:r>
-        <m:r>
-          <w:rPr>
-            <w:rFonts w:ascii="Cambria Math" w:hAnsi="Cambria Math"/>
-          </w:rPr>
-          <m:t>200Hz</m:t>
+          <m:t>f=200Hz</m:t>
         </m:r>
       </m:oMath>
       <w:r>
@@ -16786,12 +16747,12 @@
         <w:rPr>
           <w:rFonts w:eastAsiaTheme="minorEastAsia"/>
         </w:rPr>
-      </w:r>
-      <w:r>
-        <w:rPr>
-          <w:rFonts w:eastAsiaTheme="minorEastAsia"/>
-        </w:rPr>
         <w:instrText xml:space="preserve"> \* MERGEFORMAT </w:instrText>
+      </w:r>
+      <w:r>
+        <w:rPr>
+          <w:rFonts w:eastAsiaTheme="minorEastAsia"/>
+        </w:rPr>
       </w:r>
       <w:r>
         <w:rPr>
@@ -16933,12 +16894,12 @@
         <w:rPr>
           <w:rFonts w:eastAsiaTheme="minorEastAsia"/>
         </w:rPr>
-      </w:r>
-      <w:r>
-        <w:rPr>
-          <w:rFonts w:eastAsiaTheme="minorEastAsia"/>
-        </w:rPr>
         <w:instrText xml:space="preserve"> \* MERGEFORMAT </w:instrText>
+      </w:r>
+      <w:r>
+        <w:rPr>
+          <w:rFonts w:eastAsiaTheme="minorEastAsia"/>
+        </w:rPr>
       </w:r>
       <w:r>
         <w:rPr>
@@ -17490,12 +17451,12 @@
         <w:rPr>
           <w:rFonts w:eastAsiaTheme="minorEastAsia"/>
         </w:rPr>
-      </w:r>
-      <w:r>
-        <w:rPr>
-          <w:rFonts w:eastAsiaTheme="minorEastAsia"/>
-        </w:rPr>
         <w:instrText xml:space="preserve"> \* MERGEFORMAT </w:instrText>
+      </w:r>
+      <w:r>
+        <w:rPr>
+          <w:rFonts w:eastAsiaTheme="minorEastAsia"/>
+        </w:rPr>
       </w:r>
       <w:r>
         <w:rPr>
@@ -17538,6 +17499,9 @@
         <w:jc w:val="center"/>
       </w:pPr>
       <w:r>
+        <w:rPr>
+          <w:noProof/>
+        </w:rPr>
         <w:drawing>
           <wp:inline distT="0" distB="0" distL="0" distR="0" wp14:anchorId="591D0D5B" wp14:editId="5C18B15D">
             <wp:extent cx="2208598" cy="1939026"/>
@@ -17614,6 +17578,9 @@
         <w:jc w:val="center"/>
       </w:pPr>
       <w:r>
+        <w:rPr>
+          <w:noProof/>
+        </w:rPr>
         <w:drawing>
           <wp:inline distT="0" distB="0" distL="0" distR="0" wp14:anchorId="5AF37A22" wp14:editId="79F4DFBD">
             <wp:extent cx="3554867" cy="1786886"/>
@@ -18243,7 +18210,7 @@
       <w:lvlText w:val="%1.%2."/>
       <w:lvlJc w:val="left"/>
       <w:pPr>
-        <w:ind w:left="576" w:hanging="576"/>
+        <w:ind w:left="4404" w:hanging="576"/>
       </w:pPr>
       <w:rPr>
         <w:rFonts w:hint="default"/>
@@ -18474,7 +18441,7 @@
         <w:kern w:val="2"/>
         <w:sz w:val="24"/>
         <w:szCs w:val="24"/>
-        <w:lang w:val="en-001" w:eastAsia="en-US" w:bidi="ar-SA"/>
+        <w:lang w:eastAsia="en-US" w:bidi="ar-SA"/>
         <w14:ligatures w14:val="standardContextual"/>
       </w:rPr>
     </w:rPrDefault>
@@ -18911,6 +18878,7 @@
         <w:numId w:val="1"/>
       </w:numPr>
       <w:spacing w:before="160" w:after="80"/>
+      <w:ind w:left="576"/>
       <w:outlineLvl w:val="1"/>
     </w:pPr>
     <w:rPr>
@@ -19105,6 +19073,7 @@
   <w:style w:type="character" w:default="1" w:styleId="DefaultParagraphFont">
     <w:name w:val="Default Paragraph Font"/>
     <w:uiPriority w:val="1"/>
+    <w:semiHidden/>
     <w:unhideWhenUsed/>
   </w:style>
   <w:style w:type="table" w:default="1" w:styleId="TableNormal">
@@ -19780,7 +19749,10 @@
   <w:rsids>
     <w:rsidRoot w:val="00E55D9D"/>
     <w:rsid w:val="002C75F6"/>
+    <w:rsid w:val="005917EC"/>
     <w:rsid w:val="00920CD1"/>
+    <w:rsid w:val="00CA36CF"/>
+    <w:rsid w:val="00D76EE0"/>
     <w:rsid w:val="00E55D9D"/>
   </w:rsids>
   <m:mathPr>
@@ -19796,7 +19768,7 @@
     <m:intLim m:val="subSup"/>
     <m:naryLim m:val="undOvr"/>
   </m:mathPr>
-  <w:themeFontLang w:val="en-001"/>
+  <w:themeFontLang/>
   <w:clrSchemeMapping w:bg1="light1" w:t1="dark1" w:bg2="light2" w:t2="dark2" w:accent1="accent1" w:accent2="accent2" w:accent3="accent3" w:accent4="accent4" w:accent5="accent5" w:accent6="accent6" w:hyperlink="hyperlink" w:followedHyperlink="followedHyperlink"/>
   <w:decimalSymbol w:val="."/>
   <w:listSeparator w:val=","/>
@@ -19813,7 +19785,7 @@
         <w:kern w:val="2"/>
         <w:sz w:val="24"/>
         <w:szCs w:val="24"/>
-        <w:lang w:val="en-001" w:eastAsia="en-001" w:bidi="ar-SA"/>
+        <w:lang w:bidi="ar-SA"/>
         <w14:ligatures w14:val="standardContextual"/>
       </w:rPr>
     </w:rPrDefault>

</xml_diff>